<commit_message>
Retail OS page and terms doc: 40% standard split
Co-Authored-By: Claude Opus 5.5 <noreply@anthropic.com>
</commit_message>
<xml_diff>
--- a/public/retail-os/docs/DevShop-Retail-OS-Partnership-Terms.docx
+++ b/public/retail-os/docs/DevShop-Retail-OS-Partnership-Terms.docx
@@ -193,14 +193,14 @@
                 <w:sz w:val="21"/>
                 <w:szCs w:val="21"/>
               </w:rPr>
-              <w:t xml:space="preserve">[____]</w:t>
-            </w:r>
-            <w:r>
-              <w:rPr>
-                <w:sz w:val="19"/>
-                <w:szCs w:val="19"/>
-              </w:rPr>
-              <w:t xml:space="preserve">% of the profit pool (range 25–50%). Brand keeps 100% of its IP.</w:t>
+              <w:t xml:space="preserve">40</w:t>
+            </w:r>
+            <w:r>
+              <w:rPr>
+                <w:sz w:val="19"/>
+                <w:szCs w:val="19"/>
+              </w:rPr>
+              <w:t xml:space="preserve">% of the profit pool (standard; lower only if agreed). Brand keeps 100% of its IP.</w:t>
             </w:r>
           </w:p>
         </w:tc>

</xml_diff>